<commit_message>
Finalize binary 6MWT scenario outputs
Co-authored-by: dreamcheap2000 <229635625+dreamcheap2000@users.noreply.github.com>
</commit_message>
<xml_diff>
--- a/20260826_Binary_1038.docx
+++ b/20260826_Binary_1038.docx
@@ -900,7 +900,7 @@
               <w:rPr>
                 <w:sz w:val="18"/>
               </w:rPr>
-              <w:t>0.1945</w:t>
+              <w:t>0.2160</w:t>
             </w:r>
           </w:p>
         </w:tc>
@@ -913,7 +913,7 @@
               <w:rPr>
                 <w:sz w:val="18"/>
               </w:rPr>
-              <w:t>0.0340</w:t>
+              <w:t>0.0195</w:t>
             </w:r>
           </w:p>
         </w:tc>
@@ -941,7 +941,7 @@
               <w:rPr>
                 <w:sz w:val="18"/>
               </w:rPr>
-              <w:t>0.1106</w:t>
+              <w:t>0.1045</w:t>
             </w:r>
           </w:p>
         </w:tc>
@@ -954,7 +954,7 @@
               <w:rPr>
                 <w:sz w:val="18"/>
               </w:rPr>
-              <w:t>0.0269</w:t>
+              <w:t>0.0357</w:t>
             </w:r>
           </w:p>
         </w:tc>
@@ -982,7 +982,7 @@
               <w:rPr>
                 <w:sz w:val="18"/>
               </w:rPr>
-              <w:t>0.0656</w:t>
+              <w:t>0.0976</w:t>
             </w:r>
           </w:p>
         </w:tc>
@@ -995,7 +995,130 @@
               <w:rPr>
                 <w:sz w:val="18"/>
               </w:rPr>
-              <w:t>0.0266</w:t>
+              <w:t>0.0237</w:t>
+            </w:r>
+          </w:p>
+        </w:tc>
+      </w:tr>
+      <w:tr>
+        <w:tc>
+          <w:tcPr>
+            <w:tcW w:type="dxa" w:w="2880"/>
+          </w:tcPr>
+          <w:p>
+            <w:r>
+              <w:rPr>
+                <w:sz w:val="18"/>
+              </w:rPr>
+              <w:t>FuglSEN1</w:t>
+            </w:r>
+          </w:p>
+        </w:tc>
+        <w:tc>
+          <w:tcPr>
+            <w:tcW w:type="dxa" w:w="2880"/>
+          </w:tcPr>
+          <w:p>
+            <w:r>
+              <w:rPr>
+                <w:sz w:val="18"/>
+              </w:rPr>
+              <w:t>0.0119</w:t>
+            </w:r>
+          </w:p>
+        </w:tc>
+        <w:tc>
+          <w:tcPr>
+            <w:tcW w:type="dxa" w:w="2880"/>
+          </w:tcPr>
+          <w:p>
+            <w:r>
+              <w:rPr>
+                <w:sz w:val="18"/>
+              </w:rPr>
+              <w:t>0.0156</w:t>
+            </w:r>
+          </w:p>
+        </w:tc>
+      </w:tr>
+      <w:tr>
+        <w:tc>
+          <w:tcPr>
+            <w:tcW w:type="dxa" w:w="2880"/>
+          </w:tcPr>
+          <w:p>
+            <w:r>
+              <w:rPr>
+                <w:sz w:val="18"/>
+              </w:rPr>
+              <w:t>FuglUE1</w:t>
+            </w:r>
+          </w:p>
+        </w:tc>
+        <w:tc>
+          <w:tcPr>
+            <w:tcW w:type="dxa" w:w="2880"/>
+          </w:tcPr>
+          <w:p>
+            <w:r>
+              <w:rPr>
+                <w:sz w:val="18"/>
+              </w:rPr>
+              <w:t>0.0084</w:t>
+            </w:r>
+          </w:p>
+        </w:tc>
+        <w:tc>
+          <w:tcPr>
+            <w:tcW w:type="dxa" w:w="2880"/>
+          </w:tcPr>
+          <w:p>
+            <w:r>
+              <w:rPr>
+                <w:sz w:val="18"/>
+              </w:rPr>
+              <w:t>0.0125</w:t>
+            </w:r>
+          </w:p>
+        </w:tc>
+      </w:tr>
+      <w:tr>
+        <w:tc>
+          <w:tcPr>
+            <w:tcW w:type="dxa" w:w="2880"/>
+          </w:tcPr>
+          <w:p>
+            <w:r>
+              <w:rPr>
+                <w:sz w:val="18"/>
+              </w:rPr>
+              <w:t>MRS1</w:t>
+            </w:r>
+          </w:p>
+        </w:tc>
+        <w:tc>
+          <w:tcPr>
+            <w:tcW w:type="dxa" w:w="2880"/>
+          </w:tcPr>
+          <w:p>
+            <w:r>
+              <w:rPr>
+                <w:sz w:val="18"/>
+              </w:rPr>
+              <w:t>0.0080</w:t>
+            </w:r>
+          </w:p>
+        </w:tc>
+        <w:tc>
+          <w:tcPr>
+            <w:tcW w:type="dxa" w:w="2880"/>
+          </w:tcPr>
+          <w:p>
+            <w:r>
+              <w:rPr>
+                <w:sz w:val="18"/>
+              </w:rPr>
+              <w:t>0.0072</w:t>
             </w:r>
           </w:p>
         </w:tc>
@@ -1023,7 +1146,7 @@
               <w:rPr>
                 <w:sz w:val="18"/>
               </w:rPr>
-              <w:t>0.0006</w:t>
+              <w:t>0.0072</w:t>
             </w:r>
           </w:p>
         </w:tc>
@@ -1036,7 +1159,89 @@
               <w:rPr>
                 <w:sz w:val="18"/>
               </w:rPr>
-              <w:t>0.0012</w:t>
+              <w:t>0.0087</w:t>
+            </w:r>
+          </w:p>
+        </w:tc>
+      </w:tr>
+      <w:tr>
+        <w:tc>
+          <w:tcPr>
+            <w:tcW w:type="dxa" w:w="2880"/>
+          </w:tcPr>
+          <w:p>
+            <w:r>
+              <w:rPr>
+                <w:sz w:val="18"/>
+              </w:rPr>
+              <w:t>MNA1</w:t>
+            </w:r>
+          </w:p>
+        </w:tc>
+        <w:tc>
+          <w:tcPr>
+            <w:tcW w:type="dxa" w:w="2880"/>
+          </w:tcPr>
+          <w:p>
+            <w:r>
+              <w:rPr>
+                <w:sz w:val="18"/>
+              </w:rPr>
+              <w:t>0.0048</w:t>
+            </w:r>
+          </w:p>
+        </w:tc>
+        <w:tc>
+          <w:tcPr>
+            <w:tcW w:type="dxa" w:w="2880"/>
+          </w:tcPr>
+          <w:p>
+            <w:r>
+              <w:rPr>
+                <w:sz w:val="18"/>
+              </w:rPr>
+              <w:t>0.0225</w:t>
+            </w:r>
+          </w:p>
+        </w:tc>
+      </w:tr>
+      <w:tr>
+        <w:tc>
+          <w:tcPr>
+            <w:tcW w:type="dxa" w:w="2880"/>
+          </w:tcPr>
+          <w:p>
+            <w:r>
+              <w:rPr>
+                <w:sz w:val="18"/>
+              </w:rPr>
+              <w:t>FOIS1</w:t>
+            </w:r>
+          </w:p>
+        </w:tc>
+        <w:tc>
+          <w:tcPr>
+            <w:tcW w:type="dxa" w:w="2880"/>
+          </w:tcPr>
+          <w:p>
+            <w:r>
+              <w:rPr>
+                <w:sz w:val="18"/>
+              </w:rPr>
+              <w:t>0.0029</w:t>
+            </w:r>
+          </w:p>
+        </w:tc>
+        <w:tc>
+          <w:tcPr>
+            <w:tcW w:type="dxa" w:w="2880"/>
+          </w:tcPr>
+          <w:p>
+            <w:r>
+              <w:rPr>
+                <w:sz w:val="18"/>
+              </w:rPr>
+              <w:t>0.0069</w:t>
             </w:r>
           </w:p>
         </w:tc>
@@ -1077,212 +1282,7 @@
               <w:rPr>
                 <w:sz w:val="18"/>
               </w:rPr>
-              <w:t>0.0004</w:t>
-            </w:r>
-          </w:p>
-        </w:tc>
-      </w:tr>
-      <w:tr>
-        <w:tc>
-          <w:tcPr>
-            <w:tcW w:type="dxa" w:w="2880"/>
-          </w:tcPr>
-          <w:p>
-            <w:r>
-              <w:rPr>
-                <w:sz w:val="18"/>
-              </w:rPr>
-              <w:t>IADL1</w:t>
-            </w:r>
-          </w:p>
-        </w:tc>
-        <w:tc>
-          <w:tcPr>
-            <w:tcW w:type="dxa" w:w="2880"/>
-          </w:tcPr>
-          <w:p>
-            <w:r>
-              <w:rPr>
-                <w:sz w:val="18"/>
-              </w:rPr>
-              <w:t>-0.0026</w:t>
-            </w:r>
-          </w:p>
-        </w:tc>
-        <w:tc>
-          <w:tcPr>
-            <w:tcW w:type="dxa" w:w="2880"/>
-          </w:tcPr>
-          <w:p>
-            <w:r>
-              <w:rPr>
-                <w:sz w:val="18"/>
-              </w:rPr>
-              <w:t>0.0035</w:t>
-            </w:r>
-          </w:p>
-        </w:tc>
-      </w:tr>
-      <w:tr>
-        <w:tc>
-          <w:tcPr>
-            <w:tcW w:type="dxa" w:w="2880"/>
-          </w:tcPr>
-          <w:p>
-            <w:r>
-              <w:rPr>
-                <w:sz w:val="18"/>
-              </w:rPr>
-              <w:t>FuglSEN1</w:t>
-            </w:r>
-          </w:p>
-        </w:tc>
-        <w:tc>
-          <w:tcPr>
-            <w:tcW w:type="dxa" w:w="2880"/>
-          </w:tcPr>
-          <w:p>
-            <w:r>
-              <w:rPr>
-                <w:sz w:val="18"/>
-              </w:rPr>
-              <w:t>-0.0036</w:t>
-            </w:r>
-          </w:p>
-        </w:tc>
-        <w:tc>
-          <w:tcPr>
-            <w:tcW w:type="dxa" w:w="2880"/>
-          </w:tcPr>
-          <w:p>
-            <w:r>
-              <w:rPr>
-                <w:sz w:val="18"/>
-              </w:rPr>
-              <w:t>0.0056</w:t>
-            </w:r>
-          </w:p>
-        </w:tc>
-      </w:tr>
-      <w:tr>
-        <w:tc>
-          <w:tcPr>
-            <w:tcW w:type="dxa" w:w="2880"/>
-          </w:tcPr>
-          <w:p>
-            <w:r>
-              <w:rPr>
-                <w:sz w:val="18"/>
-              </w:rPr>
-              <w:t>FOIS1</w:t>
-            </w:r>
-          </w:p>
-        </w:tc>
-        <w:tc>
-          <w:tcPr>
-            <w:tcW w:type="dxa" w:w="2880"/>
-          </w:tcPr>
-          <w:p>
-            <w:r>
-              <w:rPr>
-                <w:sz w:val="18"/>
-              </w:rPr>
-              <w:t>-0.0044</w:t>
-            </w:r>
-          </w:p>
-        </w:tc>
-        <w:tc>
-          <w:tcPr>
-            <w:tcW w:type="dxa" w:w="2880"/>
-          </w:tcPr>
-          <w:p>
-            <w:r>
-              <w:rPr>
-                <w:sz w:val="18"/>
-              </w:rPr>
-              <w:t>0.0051</w:t>
-            </w:r>
-          </w:p>
-        </w:tc>
-      </w:tr>
-      <w:tr>
-        <w:tc>
-          <w:tcPr>
-            <w:tcW w:type="dxa" w:w="2880"/>
-          </w:tcPr>
-          <w:p>
-            <w:r>
-              <w:rPr>
-                <w:sz w:val="18"/>
-              </w:rPr>
-              <w:t>FuglUE1</w:t>
-            </w:r>
-          </w:p>
-        </w:tc>
-        <w:tc>
-          <w:tcPr>
-            <w:tcW w:type="dxa" w:w="2880"/>
-          </w:tcPr>
-          <w:p>
-            <w:r>
-              <w:rPr>
-                <w:sz w:val="18"/>
-              </w:rPr>
-              <w:t>-0.0050</w:t>
-            </w:r>
-          </w:p>
-        </w:tc>
-        <w:tc>
-          <w:tcPr>
-            <w:tcW w:type="dxa" w:w="2880"/>
-          </w:tcPr>
-          <w:p>
-            <w:r>
-              <w:rPr>
-                <w:sz w:val="18"/>
-              </w:rPr>
-              <w:t>0.0038</w:t>
-            </w:r>
-          </w:p>
-        </w:tc>
-      </w:tr>
-      <w:tr>
-        <w:tc>
-          <w:tcPr>
-            <w:tcW w:type="dxa" w:w="2880"/>
-          </w:tcPr>
-          <w:p>
-            <w:r>
-              <w:rPr>
-                <w:sz w:val="18"/>
-              </w:rPr>
-              <w:t>MRS1</w:t>
-            </w:r>
-          </w:p>
-        </w:tc>
-        <w:tc>
-          <w:tcPr>
-            <w:tcW w:type="dxa" w:w="2880"/>
-          </w:tcPr>
-          <w:p>
-            <w:r>
-              <w:rPr>
-                <w:sz w:val="18"/>
-              </w:rPr>
-              <w:t>-0.0069</w:t>
-            </w:r>
-          </w:p>
-        </w:tc>
-        <w:tc>
-          <w:tcPr>
-            <w:tcW w:type="dxa" w:w="2880"/>
-          </w:tcPr>
-          <w:p>
-            <w:r>
-              <w:rPr>
-                <w:sz w:val="18"/>
-              </w:rPr>
-              <w:t>0.0074</w:t>
+              <w:t>0.0024</w:t>
             </w:r>
           </w:p>
         </w:tc>
@@ -2162,7 +2162,7 @@
               <w:rPr>
                 <w:sz w:val="18"/>
               </w:rPr>
-              <w:t>0.2608</w:t>
+              <w:t>0.2517</w:t>
             </w:r>
           </w:p>
         </w:tc>
@@ -2175,7 +2175,48 @@
               <w:rPr>
                 <w:sz w:val="18"/>
               </w:rPr>
-              <w:t>0.0299</w:t>
+              <w:t>0.0308</w:t>
+            </w:r>
+          </w:p>
+        </w:tc>
+      </w:tr>
+      <w:tr>
+        <w:tc>
+          <w:tcPr>
+            <w:tcW w:type="dxa" w:w="2880"/>
+          </w:tcPr>
+          <w:p>
+            <w:r>
+              <w:rPr>
+                <w:sz w:val="18"/>
+              </w:rPr>
+              <w:t>BI1</w:t>
+            </w:r>
+          </w:p>
+        </w:tc>
+        <w:tc>
+          <w:tcPr>
+            <w:tcW w:type="dxa" w:w="2880"/>
+          </w:tcPr>
+          <w:p>
+            <w:r>
+              <w:rPr>
+                <w:sz w:val="18"/>
+              </w:rPr>
+              <w:t>0.0493</w:t>
+            </w:r>
+          </w:p>
+        </w:tc>
+        <w:tc>
+          <w:tcPr>
+            <w:tcW w:type="dxa" w:w="2880"/>
+          </w:tcPr>
+          <w:p>
+            <w:r>
+              <w:rPr>
+                <w:sz w:val="18"/>
+              </w:rPr>
+              <w:t>0.0420</w:t>
             </w:r>
           </w:p>
         </w:tc>
@@ -2203,7 +2244,7 @@
               <w:rPr>
                 <w:sz w:val="18"/>
               </w:rPr>
-              <w:t>0.0209</w:t>
+              <w:t>0.0395</w:t>
             </w:r>
           </w:p>
         </w:tc>
@@ -2216,89 +2257,7 @@
               <w:rPr>
                 <w:sz w:val="18"/>
               </w:rPr>
-              <w:t>0.0138</w:t>
-            </w:r>
-          </w:p>
-        </w:tc>
-      </w:tr>
-      <w:tr>
-        <w:tc>
-          <w:tcPr>
-            <w:tcW w:type="dxa" w:w="2880"/>
-          </w:tcPr>
-          <w:p>
-            <w:r>
-              <w:rPr>
-                <w:sz w:val="18"/>
-              </w:rPr>
-              <w:t>BI1</w:t>
-            </w:r>
-          </w:p>
-        </w:tc>
-        <w:tc>
-          <w:tcPr>
-            <w:tcW w:type="dxa" w:w="2880"/>
-          </w:tcPr>
-          <w:p>
-            <w:r>
-              <w:rPr>
-                <w:sz w:val="18"/>
-              </w:rPr>
-              <w:t>0.0201</w:t>
-            </w:r>
-          </w:p>
-        </w:tc>
-        <w:tc>
-          <w:tcPr>
-            <w:tcW w:type="dxa" w:w="2880"/>
-          </w:tcPr>
-          <w:p>
-            <w:r>
-              <w:rPr>
-                <w:sz w:val="18"/>
-              </w:rPr>
-              <w:t>0.0137</w:t>
-            </w:r>
-          </w:p>
-        </w:tc>
-      </w:tr>
-      <w:tr>
-        <w:tc>
-          <w:tcPr>
-            <w:tcW w:type="dxa" w:w="2880"/>
-          </w:tcPr>
-          <w:p>
-            <w:r>
-              <w:rPr>
-                <w:sz w:val="18"/>
-              </w:rPr>
-              <w:t>MNA1</w:t>
-            </w:r>
-          </w:p>
-        </w:tc>
-        <w:tc>
-          <w:tcPr>
-            <w:tcW w:type="dxa" w:w="2880"/>
-          </w:tcPr>
-          <w:p>
-            <w:r>
-              <w:rPr>
-                <w:sz w:val="18"/>
-              </w:rPr>
-              <w:t>0.0029</w:t>
-            </w:r>
-          </w:p>
-        </w:tc>
-        <w:tc>
-          <w:tcPr>
-            <w:tcW w:type="dxa" w:w="2880"/>
-          </w:tcPr>
-          <w:p>
-            <w:r>
-              <w:rPr>
-                <w:sz w:val="18"/>
-              </w:rPr>
-              <w:t>0.0081</w:t>
+              <w:t>0.0337</w:t>
             </w:r>
           </w:p>
         </w:tc>
@@ -2326,7 +2285,35 @@
               <w:rPr>
                 <w:sz w:val="18"/>
               </w:rPr>
-              <w:t>0.0021</w:t>
+              <w:t>0.0084</w:t>
+            </w:r>
+          </w:p>
+        </w:tc>
+        <w:tc>
+          <w:tcPr>
+            <w:tcW w:type="dxa" w:w="2880"/>
+          </w:tcPr>
+          <w:p>
+            <w:r>
+              <w:rPr>
+                <w:sz w:val="18"/>
+              </w:rPr>
+              <w:t>0.0072</w:t>
+            </w:r>
+          </w:p>
+        </w:tc>
+      </w:tr>
+      <w:tr>
+        <w:tc>
+          <w:tcPr>
+            <w:tcW w:type="dxa" w:w="2880"/>
+          </w:tcPr>
+          <w:p>
+            <w:r>
+              <w:rPr>
+                <w:sz w:val="18"/>
+              </w:rPr>
+              <w:t>FuglUE1</w:t>
             </w:r>
           </w:p>
         </w:tc>
@@ -2340,6 +2327,19 @@
                 <w:sz w:val="18"/>
               </w:rPr>
               <w:t>0.0061</w:t>
+            </w:r>
+          </w:p>
+        </w:tc>
+        <w:tc>
+          <w:tcPr>
+            <w:tcW w:type="dxa" w:w="2880"/>
+          </w:tcPr>
+          <w:p>
+            <w:r>
+              <w:rPr>
+                <w:sz w:val="18"/>
+              </w:rPr>
+              <w:t>0.0096</w:t>
             </w:r>
           </w:p>
         </w:tc>
@@ -2367,7 +2367,7 @@
               <w:rPr>
                 <w:sz w:val="18"/>
               </w:rPr>
-              <w:t>0.0005</w:t>
+              <w:t>0.0048</w:t>
             </w:r>
           </w:p>
         </w:tc>
@@ -2380,7 +2380,89 @@
               <w:rPr>
                 <w:sz w:val="18"/>
               </w:rPr>
-              <w:t>0.0053</w:t>
+              <w:t>0.0103</w:t>
+            </w:r>
+          </w:p>
+        </w:tc>
+      </w:tr>
+      <w:tr>
+        <w:tc>
+          <w:tcPr>
+            <w:tcW w:type="dxa" w:w="2880"/>
+          </w:tcPr>
+          <w:p>
+            <w:r>
+              <w:rPr>
+                <w:sz w:val="18"/>
+              </w:rPr>
+              <w:t>EuroQoL5D1</w:t>
+            </w:r>
+          </w:p>
+        </w:tc>
+        <w:tc>
+          <w:tcPr>
+            <w:tcW w:type="dxa" w:w="2880"/>
+          </w:tcPr>
+          <w:p>
+            <w:r>
+              <w:rPr>
+                <w:sz w:val="18"/>
+              </w:rPr>
+              <w:t>0.0038</w:t>
+            </w:r>
+          </w:p>
+        </w:tc>
+        <w:tc>
+          <w:tcPr>
+            <w:tcW w:type="dxa" w:w="2880"/>
+          </w:tcPr>
+          <w:p>
+            <w:r>
+              <w:rPr>
+                <w:sz w:val="18"/>
+              </w:rPr>
+              <w:t>0.0074</w:t>
+            </w:r>
+          </w:p>
+        </w:tc>
+      </w:tr>
+      <w:tr>
+        <w:tc>
+          <w:tcPr>
+            <w:tcW w:type="dxa" w:w="2880"/>
+          </w:tcPr>
+          <w:p>
+            <w:r>
+              <w:rPr>
+                <w:sz w:val="18"/>
+              </w:rPr>
+              <w:t>FuglSEN1</w:t>
+            </w:r>
+          </w:p>
+        </w:tc>
+        <w:tc>
+          <w:tcPr>
+            <w:tcW w:type="dxa" w:w="2880"/>
+          </w:tcPr>
+          <w:p>
+            <w:r>
+              <w:rPr>
+                <w:sz w:val="18"/>
+              </w:rPr>
+              <w:t>0.0031</w:t>
+            </w:r>
+          </w:p>
+        </w:tc>
+        <w:tc>
+          <w:tcPr>
+            <w:tcW w:type="dxa" w:w="2880"/>
+          </w:tcPr>
+          <w:p>
+            <w:r>
+              <w:rPr>
+                <w:sz w:val="18"/>
+              </w:rPr>
+              <w:t>0.0070</w:t>
             </w:r>
           </w:p>
         </w:tc>
@@ -2408,7 +2490,7 @@
               <w:rPr>
                 <w:sz w:val="18"/>
               </w:rPr>
-              <w:t>0.0005</w:t>
+              <w:t>0.0030</w:t>
             </w:r>
           </w:p>
         </w:tc>
@@ -2421,7 +2503,7 @@
               <w:rPr>
                 <w:sz w:val="18"/>
               </w:rPr>
-              <w:t>0.0054</w:t>
+              <w:t>0.0073</w:t>
             </w:r>
           </w:p>
         </w:tc>
@@ -2436,7 +2518,7 @@
               <w:rPr>
                 <w:sz w:val="18"/>
               </w:rPr>
-              <w:t>FuglUE1</w:t>
+              <w:t>Sex, F0 M1</w:t>
             </w:r>
           </w:p>
         </w:tc>
@@ -2449,7 +2531,7 @@
               <w:rPr>
                 <w:sz w:val="18"/>
               </w:rPr>
-              <w:t>-0.0008</w:t>
+              <w:t>0.0029</w:t>
             </w:r>
           </w:p>
         </w:tc>
@@ -2462,89 +2544,7 @@
               <w:rPr>
                 <w:sz w:val="18"/>
               </w:rPr>
-              <w:t>0.0003</w:t>
-            </w:r>
-          </w:p>
-        </w:tc>
-      </w:tr>
-      <w:tr>
-        <w:tc>
-          <w:tcPr>
-            <w:tcW w:type="dxa" w:w="2880"/>
-          </w:tcPr>
-          <w:p>
-            <w:r>
-              <w:rPr>
-                <w:sz w:val="18"/>
-              </w:rPr>
-              <w:t>FuglSEN1</w:t>
-            </w:r>
-          </w:p>
-        </w:tc>
-        <w:tc>
-          <w:tcPr>
-            <w:tcW w:type="dxa" w:w="2880"/>
-          </w:tcPr>
-          <w:p>
-            <w:r>
-              <w:rPr>
-                <w:sz w:val="18"/>
-              </w:rPr>
-              <w:t>-0.0014</w:t>
-            </w:r>
-          </w:p>
-        </w:tc>
-        <w:tc>
-          <w:tcPr>
-            <w:tcW w:type="dxa" w:w="2880"/>
-          </w:tcPr>
-          <w:p>
-            <w:r>
-              <w:rPr>
-                <w:sz w:val="18"/>
-              </w:rPr>
-              <w:t>0.0024</w:t>
-            </w:r>
-          </w:p>
-        </w:tc>
-      </w:tr>
-      <w:tr>
-        <w:tc>
-          <w:tcPr>
-            <w:tcW w:type="dxa" w:w="2880"/>
-          </w:tcPr>
-          <w:p>
-            <w:r>
-              <w:rPr>
-                <w:sz w:val="18"/>
-              </w:rPr>
-              <w:t>EuroQoL5D1</w:t>
-            </w:r>
-          </w:p>
-        </w:tc>
-        <w:tc>
-          <w:tcPr>
-            <w:tcW w:type="dxa" w:w="2880"/>
-          </w:tcPr>
-          <w:p>
-            <w:r>
-              <w:rPr>
-                <w:sz w:val="18"/>
-              </w:rPr>
-              <w:t>-0.0015</w:t>
-            </w:r>
-          </w:p>
-        </w:tc>
-        <w:tc>
-          <w:tcPr>
-            <w:tcW w:type="dxa" w:w="2880"/>
-          </w:tcPr>
-          <w:p>
-            <w:r>
-              <w:rPr>
-                <w:sz w:val="18"/>
-              </w:rPr>
-              <w:t>0.0019</w:t>
+              <w:t>0.0076</w:t>
             </w:r>
           </w:p>
         </w:tc>

</xml_diff>